<commit_message>
Updating components installation instructions
</commit_message>
<xml_diff>
--- a/Quaystone components - How to install it.docx
+++ b/Quaystone components - How to install it.docx
@@ -758,6 +758,118 @@
                 <w:lang w:val="en-GB"/>
               </w:rPr>
               <w:t>).</w:t>
+            </w:r>
+          </w:p>
+        </w:tc>
+      </w:tr>
+      <w:tr>
+        <w:trPr>
+          <w:trHeight w:val="851"/>
+        </w:trPr>
+        <w:tc>
+          <w:tcPr>
+            <w:tcW w:w="2972" w:type="dxa"/>
+          </w:tcPr>
+          <w:p>
+            <w:pPr>
+              <w:rPr>
+                <w:lang w:val="en-GB"/>
+              </w:rPr>
+            </w:pPr>
+            <w:proofErr w:type="spellStart"/>
+            <w:r>
+              <w:rPr>
+                <w:lang w:val="en-GB"/>
+              </w:rPr>
+              <w:t>ShellControls</w:t>
+            </w:r>
+            <w:proofErr w:type="spellEnd"/>
+          </w:p>
+        </w:tc>
+        <w:tc>
+          <w:tcPr>
+            <w:tcW w:w="6044" w:type="dxa"/>
+          </w:tcPr>
+          <w:p>
+            <w:pPr>
+              <w:rPr>
+                <w:lang w:val="en-GB"/>
+              </w:rPr>
+            </w:pPr>
+            <w:r>
+              <w:rPr>
+                <w:lang w:val="en-GB"/>
+              </w:rPr>
+              <w:t>Open the</w:t>
+            </w:r>
+            <w:r>
+              <w:rPr>
+                <w:lang w:val="en-GB"/>
+              </w:rPr>
+              <w:t xml:space="preserve"> </w:t>
+            </w:r>
+            <w:proofErr w:type="spellStart"/>
+            <w:r>
+              <w:rPr>
+                <w:color w:val="4472C4" w:themeColor="accent1"/>
+                <w:lang w:val="en-GB"/>
+              </w:rPr>
+              <w:t>ShellControls.</w:t>
+            </w:r>
+            <w:r>
+              <w:rPr>
+                <w:color w:val="4472C4" w:themeColor="accent1"/>
+                <w:lang w:val="en-GB"/>
+              </w:rPr>
+              <w:t>dproj</w:t>
+            </w:r>
+            <w:proofErr w:type="spellEnd"/>
+            <w:r>
+              <w:rPr>
+                <w:lang w:val="en-GB"/>
+              </w:rPr>
+              <w:t xml:space="preserve"> file in the</w:t>
+            </w:r>
+            <w:proofErr w:type="gramStart"/>
+            <w:r>
+              <w:rPr>
+                <w:lang w:val="en-GB"/>
+              </w:rPr>
+              <w:t xml:space="preserve"> </w:t>
+            </w:r>
+            <w:r>
+              <w:rPr>
+                <w:i/>
+                <w:iCs/>
+                <w:color w:val="ED7D31" w:themeColor="accent2"/>
+                <w:lang w:val="en-GB"/>
+              </w:rPr>
+              <w:t>..</w:t>
+            </w:r>
+            <w:proofErr w:type="gramEnd"/>
+            <w:r>
+              <w:rPr>
+                <w:i/>
+                <w:iCs/>
+                <w:color w:val="ED7D31" w:themeColor="accent2"/>
+                <w:lang w:val="en-GB"/>
+              </w:rPr>
+              <w:t>\Components\</w:t>
+            </w:r>
+            <w:r>
+              <w:rPr>
+                <w:i/>
+                <w:iCs/>
+                <w:color w:val="ED7D31" w:themeColor="accent2"/>
+                <w:lang w:val="en-GB"/>
+              </w:rPr>
+              <w:t>ShellControls</w:t>
+            </w:r>
+            <w:r>
+              <w:rPr>
+                <w:lang w:val="en-GB"/>
+              </w:rPr>
+              <w:t xml:space="preserve"> folder. Clean, build and install it.</w:t>
             </w:r>
           </w:p>
         </w:tc>

</xml_diff>

<commit_message>
QUAYS-33: Updating installer files.
</commit_message>
<xml_diff>
--- a/Quaystone components - How to install it.docx
+++ b/Quaystone components - How to install it.docx
@@ -22,11 +22,9 @@
             <w:shd w:val="clear" w:color="auto" w:fill="000000" w:themeFill="text1"/>
           </w:tcPr>
           <w:p>
-            <w:proofErr w:type="spellStart"/>
             <w:r>
               <w:t>Component</w:t>
             </w:r>
-            <w:proofErr w:type="spellEnd"/>
           </w:p>
         </w:tc>
         <w:tc>
@@ -35,11 +33,9 @@
             <w:shd w:val="clear" w:color="auto" w:fill="000000" w:themeFill="text1"/>
           </w:tcPr>
           <w:p>
-            <w:proofErr w:type="spellStart"/>
             <w:r>
               <w:t>Instructions</w:t>
             </w:r>
-            <w:proofErr w:type="spellEnd"/>
           </w:p>
         </w:tc>
       </w:tr>
@@ -52,21 +48,8 @@
             <w:tcW w:w="2972" w:type="dxa"/>
           </w:tcPr>
           <w:p>
-            <w:proofErr w:type="spellStart"/>
-            <w:r>
-              <w:t>CentreReed</w:t>
-            </w:r>
-            <w:proofErr w:type="spellEnd"/>
-            <w:r>
-              <w:t xml:space="preserve"> (CR </w:t>
-            </w:r>
-            <w:proofErr w:type="spellStart"/>
-            <w:r>
-              <w:t>Package</w:t>
-            </w:r>
-            <w:proofErr w:type="spellEnd"/>
-            <w:r>
-              <w:t>)</w:t>
+            <w:r>
+              <w:t>CentreReed (CR Package)</w:t>
             </w:r>
           </w:p>
         </w:tc>
@@ -86,7 +69,6 @@
               </w:rPr>
               <w:t xml:space="preserve">Open the </w:t>
             </w:r>
-            <w:proofErr w:type="spellStart"/>
             <w:r>
               <w:rPr>
                 <w:color w:val="4472C4" w:themeColor="accent1"/>
@@ -94,19 +76,11 @@
               </w:rPr>
               <w:t>CRPackage.dproj</w:t>
             </w:r>
-            <w:proofErr w:type="spellEnd"/>
-            <w:r>
-              <w:rPr>
-                <w:lang w:val="en-GB"/>
-              </w:rPr>
-              <w:t xml:space="preserve"> file in the</w:t>
-            </w:r>
-            <w:proofErr w:type="gramStart"/>
-            <w:r>
-              <w:rPr>
-                <w:lang w:val="en-GB"/>
-              </w:rPr>
-              <w:t xml:space="preserve"> </w:t>
+            <w:r>
+              <w:rPr>
+                <w:lang w:val="en-GB"/>
+              </w:rPr>
+              <w:t xml:space="preserve"> file in the </w:t>
             </w:r>
             <w:r>
               <w:rPr>
@@ -115,29 +89,8 @@
                 <w:color w:val="ED7D31" w:themeColor="accent2"/>
                 <w:lang w:val="en-GB"/>
               </w:rPr>
-              <w:t>..</w:t>
-            </w:r>
-            <w:proofErr w:type="gramEnd"/>
-            <w:r>
-              <w:rPr>
-                <w:i/>
-                <w:iCs/>
-                <w:color w:val="ED7D31" w:themeColor="accent2"/>
-                <w:lang w:val="en-GB"/>
-              </w:rPr>
-              <w:t>\Components\</w:t>
-            </w:r>
-            <w:proofErr w:type="spellStart"/>
-            <w:r>
-              <w:rPr>
-                <w:i/>
-                <w:iCs/>
-                <w:color w:val="ED7D31" w:themeColor="accent2"/>
-                <w:lang w:val="en-GB"/>
-              </w:rPr>
-              <w:t>CRPackage</w:t>
-            </w:r>
-            <w:proofErr w:type="spellEnd"/>
+              <w:t>..\Components\CRPackage</w:t>
+            </w:r>
             <w:r>
               <w:rPr>
                 <w:lang w:val="en-GB"/>
@@ -165,21 +118,7 @@
               <w:rPr>
                 <w:lang w:val="en-GB"/>
               </w:rPr>
-              <w:t xml:space="preserve">Microsoft </w:t>
-            </w:r>
-            <w:proofErr w:type="spellStart"/>
-            <w:r>
-              <w:rPr>
-                <w:lang w:val="en-GB"/>
-              </w:rPr>
-              <w:t>AddIns</w:t>
-            </w:r>
-            <w:proofErr w:type="spellEnd"/>
-            <w:r>
-              <w:rPr>
-                <w:lang w:val="en-GB"/>
-              </w:rPr>
-              <w:t xml:space="preserve"> (Outl</w:t>
+              <w:t>Microsoft AddIns (Outl</w:t>
             </w:r>
             <w:r>
               <w:rPr>
@@ -211,7 +150,6 @@
               </w:rPr>
               <w:t xml:space="preserve">Open the </w:t>
             </w:r>
-            <w:proofErr w:type="spellStart"/>
             <w:r>
               <w:rPr>
                 <w:color w:val="4472C4" w:themeColor="accent1"/>
@@ -219,19 +157,11 @@
               </w:rPr>
               <w:t>MSAddIn.dproj</w:t>
             </w:r>
-            <w:proofErr w:type="spellEnd"/>
-            <w:r>
-              <w:rPr>
-                <w:lang w:val="en-GB"/>
-              </w:rPr>
-              <w:t xml:space="preserve"> file in the</w:t>
-            </w:r>
-            <w:proofErr w:type="gramStart"/>
-            <w:r>
-              <w:rPr>
-                <w:lang w:val="en-GB"/>
-              </w:rPr>
-              <w:t xml:space="preserve"> </w:t>
+            <w:r>
+              <w:rPr>
+                <w:lang w:val="en-GB"/>
+              </w:rPr>
+              <w:t xml:space="preserve"> file in the </w:t>
             </w:r>
             <w:r>
               <w:rPr>
@@ -240,29 +170,8 @@
                 <w:color w:val="ED7D31" w:themeColor="accent2"/>
                 <w:lang w:val="en-GB"/>
               </w:rPr>
-              <w:t>..</w:t>
-            </w:r>
-            <w:proofErr w:type="gramEnd"/>
-            <w:r>
-              <w:rPr>
-                <w:i/>
-                <w:iCs/>
-                <w:color w:val="ED7D31" w:themeColor="accent2"/>
-                <w:lang w:val="en-GB"/>
-              </w:rPr>
-              <w:t>\Components\</w:t>
-            </w:r>
-            <w:proofErr w:type="spellStart"/>
-            <w:r>
-              <w:rPr>
-                <w:i/>
-                <w:iCs/>
-                <w:color w:val="ED7D31" w:themeColor="accent2"/>
-                <w:lang w:val="en-GB"/>
-              </w:rPr>
-              <w:t>CRPackage</w:t>
-            </w:r>
-            <w:proofErr w:type="spellEnd"/>
+              <w:t>..\Components\CRPackage</w:t>
+            </w:r>
             <w:r>
               <w:rPr>
                 <w:lang w:val="en-GB"/>
@@ -286,28 +195,12 @@
                 <w:lang w:val="en-GB"/>
               </w:rPr>
             </w:pPr>
-            <w:proofErr w:type="spellStart"/>
-            <w:r>
-              <w:rPr>
-                <w:lang w:val="en-GB"/>
-              </w:rPr>
-              <w:t>Quasidata</w:t>
-            </w:r>
-            <w:proofErr w:type="spellEnd"/>
-            <w:r>
-              <w:rPr>
-                <w:lang w:val="en-GB"/>
-              </w:rPr>
-              <w:t xml:space="preserve"> </w:t>
-            </w:r>
-            <w:proofErr w:type="spellStart"/>
-            <w:r>
-              <w:rPr>
-                <w:lang w:val="en-GB"/>
-              </w:rPr>
-              <w:t>Transfer@Once</w:t>
-            </w:r>
-            <w:proofErr w:type="spellEnd"/>
+            <w:r>
+              <w:rPr>
+                <w:lang w:val="en-GB"/>
+              </w:rPr>
+              <w:t>Quasidata Transfer@Once</w:t>
+            </w:r>
           </w:p>
         </w:tc>
         <w:tc>
@@ -368,7 +261,7 @@
               <w:rPr>
                 <w:lang w:val="en-GB"/>
               </w:rPr>
-              <w:t>Delphi Dabbler Drop File</w:t>
+              <w:t>Turbo Async Pro</w:t>
             </w:r>
           </w:p>
         </w:tc>
@@ -388,27 +281,18 @@
               </w:rPr>
               <w:t xml:space="preserve">Open the </w:t>
             </w:r>
-            <w:proofErr w:type="spellStart"/>
             <w:r>
               <w:rPr>
                 <w:color w:val="4472C4" w:themeColor="accent1"/>
                 <w:lang w:val="en-GB"/>
               </w:rPr>
-              <w:t>PJDropFile.dproj</w:t>
-            </w:r>
-            <w:proofErr w:type="spellEnd"/>
-            <w:r>
-              <w:rPr>
-                <w:lang w:val="en-GB"/>
-              </w:rPr>
-              <w:t xml:space="preserve"> file in the</w:t>
-            </w:r>
-            <w:proofErr w:type="gramStart"/>
-            <w:r>
-              <w:rPr>
-                <w:lang w:val="en-GB"/>
-              </w:rPr>
-              <w:t xml:space="preserve"> </w:t>
+              <w:t>AsyncProDelphi.groupproj</w:t>
+            </w:r>
+            <w:r>
+              <w:rPr>
+                <w:lang w:val="en-GB"/>
+              </w:rPr>
+              <w:t xml:space="preserve"> file in the </w:t>
             </w:r>
             <w:r>
               <w:rPr>
@@ -417,23 +301,49 @@
                 <w:color w:val="ED7D31" w:themeColor="accent2"/>
                 <w:lang w:val="en-GB"/>
               </w:rPr>
-              <w:t>..</w:t>
-            </w:r>
-            <w:proofErr w:type="gramEnd"/>
-            <w:r>
-              <w:rPr>
-                <w:i/>
-                <w:iCs/>
-                <w:color w:val="ED7D31" w:themeColor="accent2"/>
-                <w:lang w:val="en-GB"/>
-              </w:rPr>
-              <w:t>\Components\dd-dropfiles-5.0.5</w:t>
-            </w:r>
-            <w:r>
-              <w:rPr>
-                <w:lang w:val="en-GB"/>
-              </w:rPr>
-              <w:t xml:space="preserve"> folder. Clean, build and install it.</w:t>
+              <w:t>..\Components\ Turbo Async Pro\packages\Alexandria\Delphi</w:t>
+            </w:r>
+            <w:r>
+              <w:rPr>
+                <w:lang w:val="en-GB"/>
+              </w:rPr>
+              <w:t xml:space="preserve"> folder. Clean, build and install it (First AsyncProDR280.bpl </w:t>
+            </w:r>
+            <w:r>
+              <w:rPr>
+                <w:lang w:val="en-GB"/>
+              </w:rPr>
+              <w:t xml:space="preserve">package </w:t>
+            </w:r>
+            <w:r>
+              <w:rPr>
+                <w:lang w:val="en-GB"/>
+              </w:rPr>
+              <w:t xml:space="preserve">and </w:t>
+            </w:r>
+            <w:r>
+              <w:rPr>
+                <w:lang w:val="en-GB"/>
+              </w:rPr>
+              <w:t xml:space="preserve">then </w:t>
+            </w:r>
+            <w:r>
+              <w:rPr>
+                <w:lang w:val="en-GB"/>
+              </w:rPr>
+              <w:t>AsyncProDD280.bpl</w:t>
+            </w:r>
+            <w:r>
+              <w:rPr>
+                <w:lang w:val="en-GB"/>
+              </w:rPr>
+              <w:t xml:space="preserve"> package</w:t>
+            </w:r>
+            <w:r>
+              <w:rPr>
+                <w:lang w:val="en-GB"/>
+              </w:rPr>
+              <w:t>)</w:t>
             </w:r>
           </w:p>
         </w:tc>
@@ -456,7 +366,7 @@
               <w:rPr>
                 <w:lang w:val="en-GB"/>
               </w:rPr>
-              <w:t>Turbo Async Pro</w:t>
+              <w:t>Zorn Barcode Printing</w:t>
             </w:r>
           </w:p>
         </w:tc>
@@ -476,27 +386,18 @@
               </w:rPr>
               <w:t xml:space="preserve">Open the </w:t>
             </w:r>
-            <w:proofErr w:type="spellStart"/>
             <w:r>
               <w:rPr>
                 <w:color w:val="4472C4" w:themeColor="accent1"/>
                 <w:lang w:val="en-GB"/>
               </w:rPr>
-              <w:t>AsyncProDelphi.groupproj</w:t>
-            </w:r>
-            <w:proofErr w:type="spellEnd"/>
-            <w:r>
-              <w:rPr>
-                <w:lang w:val="en-GB"/>
-              </w:rPr>
-              <w:t xml:space="preserve"> file in the</w:t>
-            </w:r>
-            <w:proofErr w:type="gramStart"/>
-            <w:r>
-              <w:rPr>
-                <w:lang w:val="en-GB"/>
-              </w:rPr>
-              <w:t xml:space="preserve"> </w:t>
+              <w:t>BarComp.dproj</w:t>
+            </w:r>
+            <w:r>
+              <w:rPr>
+                <w:lang w:val="en-GB"/>
+              </w:rPr>
+              <w:t xml:space="preserve"> file in the </w:t>
             </w:r>
             <w:r>
               <w:rPr>
@@ -505,59 +406,13 @@
                 <w:color w:val="ED7D31" w:themeColor="accent2"/>
                 <w:lang w:val="en-GB"/>
               </w:rPr>
-              <w:t>..</w:t>
-            </w:r>
-            <w:proofErr w:type="gramEnd"/>
-            <w:r>
-              <w:rPr>
-                <w:i/>
-                <w:iCs/>
-                <w:color w:val="ED7D31" w:themeColor="accent2"/>
-                <w:lang w:val="en-GB"/>
-              </w:rPr>
-              <w:t>\Components\ Turbo Async Pro\packages\Alexandria\Delphi</w:t>
-            </w:r>
-            <w:r>
-              <w:rPr>
-                <w:lang w:val="en-GB"/>
-              </w:rPr>
-              <w:t xml:space="preserve"> folder. Clean, build and install it (First AsyncProDR280.bpl </w:t>
-            </w:r>
-            <w:r>
-              <w:rPr>
-                <w:lang w:val="en-GB"/>
-              </w:rPr>
-              <w:t xml:space="preserve">package </w:t>
-            </w:r>
-            <w:r>
-              <w:rPr>
-                <w:lang w:val="en-GB"/>
-              </w:rPr>
-              <w:t xml:space="preserve">and </w:t>
-            </w:r>
-            <w:r>
-              <w:rPr>
-                <w:lang w:val="en-GB"/>
-              </w:rPr>
-              <w:t xml:space="preserve">then </w:t>
-            </w:r>
-            <w:r>
-              <w:rPr>
-                <w:lang w:val="en-GB"/>
-              </w:rPr>
-              <w:t>AsyncProDD280.bpl</w:t>
-            </w:r>
-            <w:r>
-              <w:rPr>
-                <w:lang w:val="en-GB"/>
-              </w:rPr>
-              <w:t xml:space="preserve"> package</w:t>
-            </w:r>
-            <w:r>
-              <w:rPr>
-                <w:lang w:val="en-GB"/>
-              </w:rPr>
-              <w:t>)</w:t>
+              <w:t>..\Components\ Zorn Barcode</w:t>
+            </w:r>
+            <w:r>
+              <w:rPr>
+                <w:lang w:val="en-GB"/>
+              </w:rPr>
+              <w:t xml:space="preserve"> folder. Clean, build and install it.</w:t>
             </w:r>
           </w:p>
         </w:tc>
@@ -580,7 +435,7 @@
               <w:rPr>
                 <w:lang w:val="en-GB"/>
               </w:rPr>
-              <w:t>Zorn Barcode Printing</w:t>
+              <w:t>QuickReport</w:t>
             </w:r>
           </w:p>
         </w:tc>
@@ -598,54 +453,7 @@
               <w:rPr>
                 <w:lang w:val="en-GB"/>
               </w:rPr>
-              <w:t xml:space="preserve">Open the </w:t>
-            </w:r>
-            <w:proofErr w:type="spellStart"/>
-            <w:r>
-              <w:rPr>
-                <w:color w:val="4472C4" w:themeColor="accent1"/>
-                <w:lang w:val="en-GB"/>
-              </w:rPr>
-              <w:t>BarComp.dproj</w:t>
-            </w:r>
-            <w:proofErr w:type="spellEnd"/>
-            <w:r>
-              <w:rPr>
-                <w:lang w:val="en-GB"/>
-              </w:rPr>
-              <w:t xml:space="preserve"> file in the</w:t>
-            </w:r>
-            <w:proofErr w:type="gramStart"/>
-            <w:r>
-              <w:rPr>
-                <w:lang w:val="en-GB"/>
-              </w:rPr>
-              <w:t xml:space="preserve"> </w:t>
-            </w:r>
-            <w:r>
-              <w:rPr>
-                <w:i/>
-                <w:iCs/>
-                <w:color w:val="ED7D31" w:themeColor="accent2"/>
-                <w:lang w:val="en-GB"/>
-              </w:rPr>
-              <w:t>..</w:t>
-            </w:r>
-            <w:proofErr w:type="gramEnd"/>
-            <w:r>
-              <w:rPr>
-                <w:i/>
-                <w:iCs/>
-                <w:color w:val="ED7D31" w:themeColor="accent2"/>
-                <w:lang w:val="en-GB"/>
-              </w:rPr>
-              <w:t>\Components\ Zorn Barcode</w:t>
-            </w:r>
-            <w:r>
-              <w:rPr>
-                <w:lang w:val="en-GB"/>
-              </w:rPr>
-              <w:t xml:space="preserve"> folder. Clean, build and install it.</w:t>
+              <w:t>Update version from vendor.</w:t>
             </w:r>
           </w:p>
         </w:tc>
@@ -664,14 +472,12 @@
                 <w:lang w:val="en-GB"/>
               </w:rPr>
             </w:pPr>
-            <w:proofErr w:type="spellStart"/>
-            <w:r>
-              <w:rPr>
-                <w:lang w:val="en-GB"/>
-              </w:rPr>
-              <w:t>QuickReport</w:t>
-            </w:r>
-            <w:proofErr w:type="spellEnd"/>
+            <w:r>
+              <w:rPr>
+                <w:lang w:val="en-GB"/>
+              </w:rPr>
+              <w:t>Gnostice</w:t>
+            </w:r>
           </w:p>
         </w:tc>
         <w:tc>
@@ -688,7 +494,19 @@
               <w:rPr>
                 <w:lang w:val="en-GB"/>
               </w:rPr>
-              <w:t>Update version from vendor.</w:t>
+              <w:t>Update version from vendor (</w:t>
+            </w:r>
+            <w:r>
+              <w:rPr>
+                <w:lang w:val="en-GB"/>
+              </w:rPr>
+              <w:t>Only if QuickReport is not enough to support print options for files</w:t>
+            </w:r>
+            <w:r>
+              <w:rPr>
+                <w:lang w:val="en-GB"/>
+              </w:rPr>
+              <w:t>).</w:t>
             </w:r>
           </w:p>
         </w:tc>
@@ -707,14 +525,12 @@
                 <w:lang w:val="en-GB"/>
               </w:rPr>
             </w:pPr>
-            <w:proofErr w:type="spellStart"/>
-            <w:r>
-              <w:rPr>
-                <w:lang w:val="en-GB"/>
-              </w:rPr>
-              <w:t>Gnostice</w:t>
-            </w:r>
-            <w:proofErr w:type="spellEnd"/>
+            <w:r>
+              <w:rPr>
+                <w:lang w:val="en-GB"/>
+              </w:rPr>
+              <w:t>ShellControls</w:t>
+            </w:r>
           </w:p>
         </w:tc>
         <w:tc>
@@ -731,75 +547,6 @@
               <w:rPr>
                 <w:lang w:val="en-GB"/>
               </w:rPr>
-              <w:t>Update version from vendor (</w:t>
-            </w:r>
-            <w:r>
-              <w:rPr>
-                <w:lang w:val="en-GB"/>
-              </w:rPr>
-              <w:t xml:space="preserve">Only if </w:t>
-            </w:r>
-            <w:proofErr w:type="spellStart"/>
-            <w:r>
-              <w:rPr>
-                <w:lang w:val="en-GB"/>
-              </w:rPr>
-              <w:t>QuickReport</w:t>
-            </w:r>
-            <w:proofErr w:type="spellEnd"/>
-            <w:r>
-              <w:rPr>
-                <w:lang w:val="en-GB"/>
-              </w:rPr>
-              <w:t xml:space="preserve"> is not enough to support print options for files</w:t>
-            </w:r>
-            <w:r>
-              <w:rPr>
-                <w:lang w:val="en-GB"/>
-              </w:rPr>
-              <w:t>).</w:t>
-            </w:r>
-          </w:p>
-        </w:tc>
-      </w:tr>
-      <w:tr>
-        <w:trPr>
-          <w:trHeight w:val="851"/>
-        </w:trPr>
-        <w:tc>
-          <w:tcPr>
-            <w:tcW w:w="2972" w:type="dxa"/>
-          </w:tcPr>
-          <w:p>
-            <w:pPr>
-              <w:rPr>
-                <w:lang w:val="en-GB"/>
-              </w:rPr>
-            </w:pPr>
-            <w:proofErr w:type="spellStart"/>
-            <w:r>
-              <w:rPr>
-                <w:lang w:val="en-GB"/>
-              </w:rPr>
-              <w:t>ShellControls</w:t>
-            </w:r>
-            <w:proofErr w:type="spellEnd"/>
-          </w:p>
-        </w:tc>
-        <w:tc>
-          <w:tcPr>
-            <w:tcW w:w="6044" w:type="dxa"/>
-          </w:tcPr>
-          <w:p>
-            <w:pPr>
-              <w:rPr>
-                <w:lang w:val="en-GB"/>
-              </w:rPr>
-            </w:pPr>
-            <w:r>
-              <w:rPr>
-                <w:lang w:val="en-GB"/>
-              </w:rPr>
               <w:t>Open the</w:t>
             </w:r>
             <w:r>
@@ -808,7 +555,6 @@
               </w:rPr>
               <w:t xml:space="preserve"> </w:t>
             </w:r>
-            <w:proofErr w:type="spellStart"/>
             <w:r>
               <w:rPr>
                 <w:color w:val="4472C4" w:themeColor="accent1"/>
@@ -823,19 +569,11 @@
               </w:rPr>
               <w:t>dproj</w:t>
             </w:r>
-            <w:proofErr w:type="spellEnd"/>
-            <w:r>
-              <w:rPr>
-                <w:lang w:val="en-GB"/>
-              </w:rPr>
-              <w:t xml:space="preserve"> file in the</w:t>
-            </w:r>
-            <w:proofErr w:type="gramStart"/>
-            <w:r>
-              <w:rPr>
-                <w:lang w:val="en-GB"/>
-              </w:rPr>
-              <w:t xml:space="preserve"> </w:t>
+            <w:r>
+              <w:rPr>
+                <w:lang w:val="en-GB"/>
+              </w:rPr>
+              <w:t xml:space="preserve"> file in the </w:t>
             </w:r>
             <w:r>
               <w:rPr>
@@ -844,17 +582,7 @@
                 <w:color w:val="ED7D31" w:themeColor="accent2"/>
                 <w:lang w:val="en-GB"/>
               </w:rPr>
-              <w:t>..</w:t>
-            </w:r>
-            <w:proofErr w:type="gramEnd"/>
-            <w:r>
-              <w:rPr>
-                <w:i/>
-                <w:iCs/>
-                <w:color w:val="ED7D31" w:themeColor="accent2"/>
-                <w:lang w:val="en-GB"/>
-              </w:rPr>
-              <w:t>\Components\</w:t>
+              <w:t>..\Components\</w:t>
             </w:r>
             <w:r>
               <w:rPr>

</xml_diff>